<commit_message>
Add report-level full-text exclusion list (Table S2) with verified citations
Cite all 36 excluded reports in Section 3.1 and the reference list with
principal reason and specific basis; correct author and bibliographic
errors in the supplied log; state the preprint-duplicate rule; mark PRISMA
item 16b as reported.

Co-Authored-By: Claude Opus 5.5 <noreply@anthropic.com>
Claude-Session: https://claude.ai/code/session_01XhsrtZoNnNZHM2jxbhbhEo
</commit_message>
<xml_diff>
--- a/submission/3_PRISMA_2020_Checklist.docx
+++ b/submission/3_PRISMA_2020_Checklist.docx
@@ -1229,7 +1229,7 @@
           </w:tcPr>
           <w:p>
             <w:r>
-              <w:t>Partially reported: exclusions by principal reason (Figure 1; Table S2); report-level list with reasons available from the corresponding author (Data Availability Statement)</w:t>
+              <w:t>Reported: Section 3.1; Figure 1; Table S2 (all 36 reports excluded at full text cited, each with its principal reason and specific basis)</w:t>
             </w:r>
           </w:p>
         </w:tc>
@@ -2110,7 +2110,7 @@
           </w:tcPr>
           <w:p>
             <w:r>
-              <w:t>Reported: Data Availability Statement; Supplementary Materials (Tables S1–S8); extraction dataset and excluded-report list available on request</w:t>
+              <w:t>Reported: Data Availability Statement; Supplementary Materials (Tables S1–S8); machine-readable extraction dataset available on request</w:t>
             </w:r>
           </w:p>
         </w:tc>

</xml_diff>